<commit_message>
Add bootstrap CIs, confidence intervals doc, and RCS visualization
- bootstrap_ci_paper.py: 95% CIs for AUROC, AUPRC, precision, sensitivity,
  specificity, accuracy, F1 (Youden threshold) across all 6 aki-analysis models
- bootstrap_ci_summary.csv: full results for test + MIMIC-III splits
- bootstrap_elasticnet_coef.py: script for elastic net coefficient CIs (30%
  subsampling m-out-of-n bootstrap; run still pending)
- confidence_intervals.docx: landscape table with all metrics + CIs
- sensitivity_paper_version.docx: updated comparison table (primary vs paper
  version AUROC/AUPRC with CIs)
- rcs_age_sex_curves_knots.png: age-risk curves by sex with knot positions
- flow_diagram_current.docx: CKD survival exclusion row and N updates
</commit_message>
<xml_diff>
--- a/flow_diagram_current.docx
+++ b/flow_diagram_current.docx
@@ -278,20 +278,59 @@
                 <w:sz w:val="18"/>
                 <w:szCs w:val="18"/>
               </w:rPr>
-              <w:t>Excluded: 7,419</w:t>
-            </w:r>
-          </w:p>
-          <w:p>
-            <w:pPr>
-              <w:spacing w:after="20"/>
-            </w:pPr>
-            <w:r>
-              <w:rPr>
-                <w:rFonts w:ascii="Arial" w:hAnsi="Arial" w:cs="Arial"/>
-                <w:sz w:val="17"/>
-                <w:szCs w:val="17"/>
-              </w:rPr>
-              <w:t>• Age &lt; 18 y</w:t>
+              <w:t>Excluded: 89,148 admissions | 31,418 patients</w:t>
+            </w:r>
+          </w:p>
+          <w:p>
+            <w:pPr>
+              <w:spacing w:after="14"/>
+            </w:pPr>
+            <w:r>
+              <w:rPr>
+                <w:rFonts w:ascii="Arial" w:hAnsi="Arial" w:cs="Arial"/>
+                <w:sz w:val="17"/>
+                <w:szCs w:val="17"/>
+              </w:rPr>
+              <w:t>• Age &lt;18 years: 0 adm | 0 patients</w:t>
+            </w:r>
+          </w:p>
+          <w:p>
+            <w:pPr>
+              <w:spacing w:after="14"/>
+            </w:pPr>
+            <w:r>
+              <w:rPr>
+                <w:rFonts w:ascii="Arial" w:hAnsi="Arial" w:cs="Arial"/>
+                <w:sz w:val="17"/>
+                <w:szCs w:val="17"/>
+              </w:rPr>
+              <w:t>• Primary AKI: 6,888 adm | 5,627 patients</w:t>
+            </w:r>
+          </w:p>
+          <w:p>
+            <w:pPr>
+              <w:spacing w:after="14"/>
+            </w:pPr>
+            <w:r>
+              <w:rPr>
+                <w:rFonts w:ascii="Arial" w:hAnsi="Arial" w:cs="Arial"/>
+                <w:sz w:val="17"/>
+                <w:szCs w:val="17"/>
+              </w:rPr>
+              <w:t>• Prior CKD: 82,860 adm | 29,257 patients</w:t>
+            </w:r>
+          </w:p>
+          <w:p>
+            <w:pPr>
+              <w:spacing w:after="14"/>
+            </w:pPr>
+            <w:r>
+              <w:rPr>
+                <w:rFonts w:ascii="Arial" w:hAnsi="Arial" w:cs="Arial"/>
+                <w:sz w:val="17"/>
+                <w:szCs w:val="17"/>
+              </w:rPr>
+              <w:t>• ESRD/dialysis: 17,911 adm | 4,750 patients</w:t>
             </w:r>
           </w:p>
           <w:p>
@@ -304,7 +343,7 @@
                 <w:sz w:val="17"/>
                 <w:szCs w:val="17"/>
               </w:rPr>
-              <w:t>• AKI as primary diagnosis (seq_num = 1)</w:t>
+              <w:t>• Kidney transplant: 5,225 adm | 1,365 patients</w:t>
             </w:r>
           </w:p>
         </w:tc>
@@ -351,20 +390,59 @@
                 <w:sz w:val="18"/>
                 <w:szCs w:val="18"/>
               </w:rPr>
-              <w:t>Excluded: 690</w:t>
-            </w:r>
-          </w:p>
-          <w:p>
-            <w:pPr>
-              <w:spacing w:after="20"/>
-            </w:pPr>
-            <w:r>
-              <w:rPr>
-                <w:rFonts w:ascii="Arial" w:hAnsi="Arial" w:cs="Arial"/>
-                <w:sz w:val="17"/>
-                <w:szCs w:val="17"/>
-              </w:rPr>
-              <w:t>• Age &lt; 18 y</w:t>
+              <w:t>Excluded: 15,749 admissions | 13,304 patients</w:t>
+            </w:r>
+          </w:p>
+          <w:p>
+            <w:pPr>
+              <w:spacing w:after="14"/>
+            </w:pPr>
+            <w:r>
+              <w:rPr>
+                <w:rFonts w:ascii="Arial" w:hAnsi="Arial" w:cs="Arial"/>
+                <w:sz w:val="17"/>
+                <w:szCs w:val="17"/>
+              </w:rPr>
+              <w:t>• Age &lt;18 years: 8,180 adm | 7,942 patients</w:t>
+            </w:r>
+          </w:p>
+          <w:p>
+            <w:pPr>
+              <w:spacing w:after="14"/>
+            </w:pPr>
+            <w:r>
+              <w:rPr>
+                <w:rFonts w:ascii="Arial" w:hAnsi="Arial" w:cs="Arial"/>
+                <w:sz w:val="17"/>
+                <w:szCs w:val="17"/>
+              </w:rPr>
+              <w:t>• Primary AKI: 645 adm | 622 patients</w:t>
+            </w:r>
+          </w:p>
+          <w:p>
+            <w:pPr>
+              <w:spacing w:after="14"/>
+            </w:pPr>
+            <w:r>
+              <w:rPr>
+                <w:rFonts w:ascii="Arial" w:hAnsi="Arial" w:cs="Arial"/>
+                <w:sz w:val="17"/>
+                <w:szCs w:val="17"/>
+              </w:rPr>
+              <w:t>• Prior CKD: 6,918 adm | 4,897 patients</w:t>
+            </w:r>
+          </w:p>
+          <w:p>
+            <w:pPr>
+              <w:spacing w:after="14"/>
+            </w:pPr>
+            <w:r>
+              <w:rPr>
+                <w:rFonts w:ascii="Arial" w:hAnsi="Arial" w:cs="Arial"/>
+                <w:sz w:val="17"/>
+                <w:szCs w:val="17"/>
+              </w:rPr>
+              <w:t>• ESRD/dialysis: 1,986 adm | 1,126 patients</w:t>
             </w:r>
           </w:p>
           <w:p>
@@ -377,7 +455,7 @@
                 <w:sz w:val="17"/>
                 <w:szCs w:val="17"/>
               </w:rPr>
-              <w:t>• AKI as primary diagnosis (seq_num = 1)</w:t>
+              <w:t>• Kidney transplant: 337 adm | 243 patients</w:t>
             </w:r>
           </w:p>
         </w:tc>
@@ -560,7 +638,7 @@
                 <w:sz w:val="18"/>
                 <w:szCs w:val="18"/>
               </w:rPr>
-              <w:t>Not incident AKI eligible (label NA): 92,280</w:t>
+              <w:t>Not incident AKI eligible (label NA): 92,280 adm | 27,573 patients</w:t>
             </w:r>
           </w:p>
           <w:p>
@@ -573,7 +651,7 @@
                 <w:sz w:val="17"/>
                 <w:szCs w:val="17"/>
               </w:rPr>
-              <w:t>• CKD-only admissions (no AKI)</w:t>
+              <w:t>• CKD-only admissions (no AKI): 51,606 adm | 20,830 patients</w:t>
             </w:r>
           </w:p>
           <w:p>
@@ -586,7 +664,7 @@
                 <w:sz w:val="17"/>
                 <w:szCs w:val="17"/>
               </w:rPr>
-              <w:t>• Repeat AKI (prior AKI history)</w:t>
+              <w:t>• Repeat AKI (prior AKI history): 58,278 adm | 15,188 patients</w:t>
             </w:r>
           </w:p>
           <w:p>
@@ -599,7 +677,7 @@
                 <w:sz w:val="17"/>
                 <w:szCs w:val="17"/>
               </w:rPr>
-              <w:t>• Prior renal impairment, no current AKI</w:t>
+              <w:t>• Prior renal impairment, no current AKI: 65,599 adm | 15,602 patients</w:t>
             </w:r>
           </w:p>
         </w:tc>
@@ -646,7 +724,7 @@
                 <w:sz w:val="18"/>
                 <w:szCs w:val="18"/>
               </w:rPr>
-              <w:t>Not incident AKI eligible (label NA): 5,700</w:t>
+              <w:t>Not incident AKI eligible (label NA): 5,700 adm | 3,669 patients</w:t>
             </w:r>
           </w:p>
           <w:p>
@@ -659,7 +737,7 @@
                 <w:sz w:val="17"/>
                 <w:szCs w:val="17"/>
               </w:rPr>
-              <w:t>• CKD-only admissions (no AKI)</w:t>
+              <w:t>• CKD-only admissions (no AKI): 3,715 adm | 2,687 patients</w:t>
             </w:r>
           </w:p>
           <w:p>
@@ -672,7 +750,7 @@
                 <w:sz w:val="17"/>
                 <w:szCs w:val="17"/>
               </w:rPr>
-              <w:t>• Repeat AKI (prior AKI history)</w:t>
+              <w:t>• Repeat AKI (prior AKI history): 2,693 adm | 1,499 patients</w:t>
             </w:r>
           </w:p>
           <w:p>
@@ -685,7 +763,7 @@
                 <w:sz w:val="17"/>
                 <w:szCs w:val="17"/>
               </w:rPr>
-              <w:t>• Prior renal impairment, no current AKI</w:t>
+              <w:t>• Prior renal impairment, no current AKI: 2,277 adm | 1,175 patients</w:t>
             </w:r>
           </w:p>
         </w:tc>
@@ -1098,6 +1176,21 @@
               <w:t>n = 40,392</w:t>
             </w:r>
           </w:p>
+          <w:p>
+            <w:pPr>
+              <w:jc w:val="center"/>
+              <w:spacing w:before="60" w:after="0"/>
+            </w:pPr>
+            <w:r>
+              <w:rPr>
+                <w:rFonts w:ascii="Arial" w:hAnsi="Arial" w:cs="Arial"/>
+                <w:color w:val="FFFFFF"/>
+                <w:sz w:val="17"/>
+                <w:szCs w:val="17"/>
+              </w:rPr>
+              <w:t>(ICD n=40,392; AutoCar n=16,969; KDIGO n=851)</w:t>
+            </w:r>
+          </w:p>
         </w:tc>
         <w:tc>
           <w:tcPr>
@@ -1182,6 +1275,21 @@
                 <w:szCs w:val="24"/>
               </w:rPr>
               <w:t>n = 9,109</w:t>
+            </w:r>
+          </w:p>
+          <w:p>
+            <w:pPr>
+              <w:jc w:val="center"/>
+              <w:spacing w:before="60" w:after="0"/>
+            </w:pPr>
+            <w:r>
+              <w:rPr>
+                <w:rFonts w:ascii="Arial" w:hAnsi="Arial" w:cs="Arial"/>
+                <w:color w:val="FFFFFF"/>
+                <w:sz w:val="17"/>
+                <w:szCs w:val="17"/>
+              </w:rPr>
+              <w:t>(ICD n=9,109; AutoCar n=5,230; KDIGO n=412)</w:t>
             </w:r>
           </w:p>
         </w:tc>
@@ -1344,6 +1452,159 @@
       <w:tr>
         <w:tc>
           <w:tcPr>
+            <w:tcW w:w="3380" w:type="dxa"/>
+            <w:shd w:val="clear" w:fill="FFF3E0"/>
+            <w:tcMar>
+              <w:top w:w="100" w:type="dxa"/>
+              <w:left w:w="160" w:type="dxa"/>
+              <w:bottom w:w="100" w:type="dxa"/>
+              <w:right w:w="160" w:type="dxa"/>
+            </w:tcMar>
+          </w:tcPr>
+          <w:p>
+            <w:pPr>
+              <w:spacing w:after="30"/>
+            </w:pPr>
+            <w:r>
+              <w:rPr>
+                <w:rFonts w:ascii="Arial" w:hAnsi="Arial" w:cs="Arial"/>
+                <w:b/>
+                <w:color w:val="BF360C"/>
+                <w:sz w:val="18"/>
+                <w:szCs w:val="18"/>
+              </w:rPr>
+              <w:t>Excluded: 3,889</w:t>
+            </w:r>
+          </w:p>
+          <w:p>
+            <w:pPr>
+              <w:spacing w:after="14"/>
+            </w:pPr>
+            <w:r>
+              <w:rPr>
+                <w:rFonts w:ascii="Arial" w:hAnsi="Arial" w:cs="Arial"/>
+                <w:sz w:val="17"/>
+                <w:szCs w:val="17"/>
+              </w:rPr>
+              <w:t>• CKD &lt;90 days: n = 3,523</w:t>
+            </w:r>
+          </w:p>
+          <w:p>
+            <w:pPr>
+              <w:spacing w:after="14"/>
+            </w:pPr>
+            <w:r>
+              <w:rPr>
+                <w:rFonts w:ascii="Arial" w:hAnsi="Arial" w:cs="Arial"/>
+                <w:sz w:val="17"/>
+                <w:szCs w:val="17"/>
+              </w:rPr>
+              <w:t>• PostCKD/ESRD &lt;90 days: n = 351</w:t>
+            </w:r>
+          </w:p>
+          <w:p>
+            <w:pPr>
+              <w:spacing w:after="0"/>
+            </w:pPr>
+            <w:r>
+              <w:rPr>
+                <w:rFonts w:ascii="Arial" w:hAnsi="Arial" w:cs="Arial"/>
+                <w:sz w:val="17"/>
+                <w:szCs w:val="17"/>
+              </w:rPr>
+              <w:t>• No follow-up data: n = 15</w:t>
+            </w:r>
+          </w:p>
+        </w:tc>
+        <w:tc>
+          <w:tcPr>
+            <w:tcW w:w="1300" w:type="dxa"/>
+          </w:tcPr>
+          <w:p>
+            <w:pPr>
+              <w:jc w:val="center"/>
+            </w:pPr>
+            <w:r>
+              <w:rPr>
+                <w:rFonts w:ascii="Arial" w:hAnsi="Arial" w:cs="Arial"/>
+                <w:color w:val="2E5F8A"/>
+                <w:sz w:val="28"/>
+                <w:szCs w:val="28"/>
+              </w:rPr>
+              <w:t>↓</w:t>
+            </w:r>
+          </w:p>
+        </w:tc>
+        <w:tc>
+          <w:tcPr>
+            <w:tcW w:w="3380" w:type="dxa"/>
+            <w:shd w:val="clear" w:fill="FFF3E0"/>
+            <w:tcMar>
+              <w:top w:w="100" w:type="dxa"/>
+              <w:left w:w="160" w:type="dxa"/>
+              <w:bottom w:w="100" w:type="dxa"/>
+              <w:right w:w="160" w:type="dxa"/>
+            </w:tcMar>
+          </w:tcPr>
+          <w:p>
+            <w:pPr>
+              <w:spacing w:after="30"/>
+            </w:pPr>
+            <w:r>
+              <w:rPr>
+                <w:rFonts w:ascii="Arial" w:hAnsi="Arial" w:cs="Arial"/>
+                <w:b/>
+                <w:color w:val="BF360C"/>
+                <w:sz w:val="18"/>
+                <w:szCs w:val="18"/>
+              </w:rPr>
+              <w:t>Excluded: 99</w:t>
+            </w:r>
+          </w:p>
+          <w:p>
+            <w:pPr>
+              <w:spacing w:after="14"/>
+            </w:pPr>
+            <w:r>
+              <w:rPr>
+                <w:rFonts w:ascii="Arial" w:hAnsi="Arial" w:cs="Arial"/>
+                <w:sz w:val="17"/>
+                <w:szCs w:val="17"/>
+              </w:rPr>
+              <w:t>• CKD &lt;90 days: n = 75</w:t>
+            </w:r>
+          </w:p>
+          <w:p>
+            <w:pPr>
+              <w:spacing w:after="14"/>
+            </w:pPr>
+            <w:r>
+              <w:rPr>
+                <w:rFonts w:ascii="Arial" w:hAnsi="Arial" w:cs="Arial"/>
+                <w:sz w:val="17"/>
+                <w:szCs w:val="17"/>
+              </w:rPr>
+              <w:t>• PostCKD/ESRD &lt;90 days: n = 12</w:t>
+            </w:r>
+          </w:p>
+          <w:p>
+            <w:pPr>
+              <w:spacing w:after="0"/>
+            </w:pPr>
+            <w:r>
+              <w:rPr>
+                <w:rFonts w:ascii="Arial" w:hAnsi="Arial" w:cs="Arial"/>
+                <w:sz w:val="17"/>
+                <w:szCs w:val="17"/>
+              </w:rPr>
+              <w:t>• No follow-up data: n = 12</w:t>
+            </w:r>
+          </w:p>
+        </w:tc>
+      </w:tr>
+      <w:tr>
+        <w:tc>
+          <w:tcPr>
             <w:tcW w:w="4680" w:type="dxa"/>
             <w:gridSpan w:val="2"/>
             <w:shd w:val="clear" w:fill="EBF3FB"/>
@@ -1390,6 +1651,14 @@
               </w:rPr>
               <w:t>9,477</w:t>
             </w:r>
+            <w:r>
+              <w:rPr>
+                <w:rFonts w:ascii="Arial" w:hAnsi="Arial" w:cs="Arial"/>
+                <w:sz w:val="17"/>
+                <w:szCs w:val="17"/>
+              </w:rPr>
+              <w:t xml:space="preserve"> (lab-based n=4,870)</w:t>
+            </w:r>
           </w:p>
           <w:p>
             <w:pPr>
@@ -1401,7 +1670,7 @@
                 <w:sz w:val="19"/>
                 <w:szCs w:val="19"/>
               </w:rPr>
-              <w:t xml:space="preserve">• Progression to ESRD / dialysis: </w:t>
+              <w:t xml:space="preserve">• PostCKD/ESRD (≥90d): </w:t>
             </w:r>
             <w:r>
               <w:rPr>
@@ -1423,7 +1692,7 @@
                 <w:sz w:val="19"/>
                 <w:szCs w:val="19"/>
               </w:rPr>
-              <w:t xml:space="preserve">• All-cause death (≥90d post-discharge): </w:t>
+              <w:t xml:space="preserve">• Death: </w:t>
             </w:r>
             <w:r>
               <w:rPr>
@@ -1506,6 +1775,14 @@
               </w:rPr>
               <w:t>274</w:t>
             </w:r>
+            <w:r>
+              <w:rPr>
+                <w:rFonts w:ascii="Arial" w:hAnsi="Arial" w:cs="Arial"/>
+                <w:sz w:val="17"/>
+                <w:szCs w:val="17"/>
+              </w:rPr>
+              <w:t xml:space="preserve"> (lab-based n=871)</w:t>
+            </w:r>
           </w:p>
           <w:p>
             <w:pPr>
@@ -1517,7 +1794,7 @@
                 <w:sz w:val="19"/>
                 <w:szCs w:val="19"/>
               </w:rPr>
-              <w:t xml:space="preserve">• Progression to ESRD / dialysis: </w:t>
+              <w:t xml:space="preserve">• PostCKD/ESRD (≥90d): </w:t>
             </w:r>
             <w:r>
               <w:rPr>
@@ -1539,7 +1816,7 @@
                 <w:sz w:val="19"/>
                 <w:szCs w:val="19"/>
               </w:rPr>
-              <w:t xml:space="preserve">• All-cause death (≥90d post-discharge): </w:t>
+              <w:t xml:space="preserve">• Death: </w:t>
             </w:r>
             <w:r>
               <w:rPr>
@@ -1753,7 +2030,82 @@
                 <w:sz w:val="17"/>
                 <w:szCs w:val="17"/>
               </w:rPr>
-              <w:t>Excluded: age &lt;18 + AKI as primary diagnosis (seq_num=1)</w:t>
+              <w:t>Excluded (admissions | patients, overlapping)</w:t>
+            </w:r>
+          </w:p>
+          <w:p>
+            <w:pPr>
+              <w:spacing w:after="10"/>
+            </w:pPr>
+            <w:r>
+              <w:rPr>
+                <w:rFonts w:ascii="Arial" w:hAnsi="Arial" w:cs="Arial"/>
+                <w:i/>
+                <w:color w:val="BF360C"/>
+                <w:sz w:val="17"/>
+                <w:szCs w:val="17"/>
+              </w:rPr>
+              <w:t xml:space="preserve">  Age &lt;18 y</w:t>
+            </w:r>
+          </w:p>
+          <w:p>
+            <w:pPr>
+              <w:spacing w:after="10"/>
+            </w:pPr>
+            <w:r>
+              <w:rPr>
+                <w:rFonts w:ascii="Arial" w:hAnsi="Arial" w:cs="Arial"/>
+                <w:i/>
+                <w:color w:val="BF360C"/>
+                <w:sz w:val="17"/>
+                <w:szCs w:val="17"/>
+              </w:rPr>
+              <w:t xml:space="preserve">  Primary AKI (seq_num=1)</w:t>
+            </w:r>
+          </w:p>
+          <w:p>
+            <w:pPr>
+              <w:spacing w:after="10"/>
+            </w:pPr>
+            <w:r>
+              <w:rPr>
+                <w:rFonts w:ascii="Arial" w:hAnsi="Arial" w:cs="Arial"/>
+                <w:i/>
+                <w:color w:val="BF360C"/>
+                <w:sz w:val="17"/>
+                <w:szCs w:val="17"/>
+              </w:rPr>
+              <w:t xml:space="preserve">  Prior CKD</w:t>
+            </w:r>
+          </w:p>
+          <w:p>
+            <w:pPr>
+              <w:spacing w:after="10"/>
+            </w:pPr>
+            <w:r>
+              <w:rPr>
+                <w:rFonts w:ascii="Arial" w:hAnsi="Arial" w:cs="Arial"/>
+                <w:i/>
+                <w:color w:val="BF360C"/>
+                <w:sz w:val="17"/>
+                <w:szCs w:val="17"/>
+              </w:rPr>
+              <w:t xml:space="preserve">  ESRD/dialysis</w:t>
+            </w:r>
+          </w:p>
+          <w:p>
+            <w:pPr>
+              <w:spacing w:after="0"/>
+            </w:pPr>
+            <w:r>
+              <w:rPr>
+                <w:rFonts w:ascii="Arial" w:hAnsi="Arial" w:cs="Arial"/>
+                <w:i/>
+                <w:color w:val="BF360C"/>
+                <w:sz w:val="17"/>
+                <w:szCs w:val="17"/>
+              </w:rPr>
+              <w:t xml:space="preserve">  Kidney transplant</w:t>
             </w:r>
           </w:p>
         </w:tc>
@@ -1773,7 +2125,87 @@
                 <w:sz w:val="17"/>
                 <w:szCs w:val="17"/>
               </w:rPr>
-              <w:t>−7,419</w:t>
+              <w:t>89,148 | 31,418</w:t>
+            </w:r>
+          </w:p>
+          <w:p>
+            <w:pPr>
+              <w:jc w:val="center"/>
+              <w:spacing w:after="10"/>
+            </w:pPr>
+            <w:r>
+              <w:rPr>
+                <w:rFonts w:ascii="Arial" w:hAnsi="Arial" w:cs="Arial"/>
+                <w:i/>
+                <w:color w:val="BF360C"/>
+                <w:sz w:val="17"/>
+                <w:szCs w:val="17"/>
+              </w:rPr>
+              <w:t>0 | 0</w:t>
+            </w:r>
+          </w:p>
+          <w:p>
+            <w:pPr>
+              <w:jc w:val="center"/>
+              <w:spacing w:after="10"/>
+            </w:pPr>
+            <w:r>
+              <w:rPr>
+                <w:rFonts w:ascii="Arial" w:hAnsi="Arial" w:cs="Arial"/>
+                <w:i/>
+                <w:color w:val="BF360C"/>
+                <w:sz w:val="17"/>
+                <w:szCs w:val="17"/>
+              </w:rPr>
+              <w:t>6,888 | 5,627</w:t>
+            </w:r>
+          </w:p>
+          <w:p>
+            <w:pPr>
+              <w:jc w:val="center"/>
+              <w:spacing w:after="10"/>
+            </w:pPr>
+            <w:r>
+              <w:rPr>
+                <w:rFonts w:ascii="Arial" w:hAnsi="Arial" w:cs="Arial"/>
+                <w:i/>
+                <w:color w:val="BF360C"/>
+                <w:sz w:val="17"/>
+                <w:szCs w:val="17"/>
+              </w:rPr>
+              <w:t>82,860 | 29,257</w:t>
+            </w:r>
+          </w:p>
+          <w:p>
+            <w:pPr>
+              <w:jc w:val="center"/>
+              <w:spacing w:after="10"/>
+            </w:pPr>
+            <w:r>
+              <w:rPr>
+                <w:rFonts w:ascii="Arial" w:hAnsi="Arial" w:cs="Arial"/>
+                <w:i/>
+                <w:color w:val="BF360C"/>
+                <w:sz w:val="17"/>
+                <w:szCs w:val="17"/>
+              </w:rPr>
+              <w:t>17,911 | 4,750</w:t>
+            </w:r>
+          </w:p>
+          <w:p>
+            <w:pPr>
+              <w:jc w:val="center"/>
+              <w:spacing w:after="0"/>
+            </w:pPr>
+            <w:r>
+              <w:rPr>
+                <w:rFonts w:ascii="Arial" w:hAnsi="Arial" w:cs="Arial"/>
+                <w:i/>
+                <w:color w:val="BF360C"/>
+                <w:sz w:val="17"/>
+                <w:szCs w:val="17"/>
+              </w:rPr>
+              <w:t>5,225 | 1,365</w:t>
             </w:r>
           </w:p>
         </w:tc>
@@ -1793,7 +2225,87 @@
                 <w:sz w:val="17"/>
                 <w:szCs w:val="17"/>
               </w:rPr>
-              <w:t>−690</w:t>
+              <w:t>15,749 | 13,304</w:t>
+            </w:r>
+          </w:p>
+          <w:p>
+            <w:pPr>
+              <w:jc w:val="center"/>
+              <w:spacing w:after="10"/>
+            </w:pPr>
+            <w:r>
+              <w:rPr>
+                <w:rFonts w:ascii="Arial" w:hAnsi="Arial" w:cs="Arial"/>
+                <w:i/>
+                <w:color w:val="BF360C"/>
+                <w:sz w:val="17"/>
+                <w:szCs w:val="17"/>
+              </w:rPr>
+              <w:t>8,180 | 7,942</w:t>
+            </w:r>
+          </w:p>
+          <w:p>
+            <w:pPr>
+              <w:jc w:val="center"/>
+              <w:spacing w:after="10"/>
+            </w:pPr>
+            <w:r>
+              <w:rPr>
+                <w:rFonts w:ascii="Arial" w:hAnsi="Arial" w:cs="Arial"/>
+                <w:i/>
+                <w:color w:val="BF360C"/>
+                <w:sz w:val="17"/>
+                <w:szCs w:val="17"/>
+              </w:rPr>
+              <w:t>645 | 622</w:t>
+            </w:r>
+          </w:p>
+          <w:p>
+            <w:pPr>
+              <w:jc w:val="center"/>
+              <w:spacing w:after="10"/>
+            </w:pPr>
+            <w:r>
+              <w:rPr>
+                <w:rFonts w:ascii="Arial" w:hAnsi="Arial" w:cs="Arial"/>
+                <w:i/>
+                <w:color w:val="BF360C"/>
+                <w:sz w:val="17"/>
+                <w:szCs w:val="17"/>
+              </w:rPr>
+              <w:t>6,918 | 4,897</w:t>
+            </w:r>
+          </w:p>
+          <w:p>
+            <w:pPr>
+              <w:jc w:val="center"/>
+              <w:spacing w:after="10"/>
+            </w:pPr>
+            <w:r>
+              <w:rPr>
+                <w:rFonts w:ascii="Arial" w:hAnsi="Arial" w:cs="Arial"/>
+                <w:i/>
+                <w:color w:val="BF360C"/>
+                <w:sz w:val="17"/>
+                <w:szCs w:val="17"/>
+              </w:rPr>
+              <w:t>1,986 | 1,126</w:t>
+            </w:r>
+          </w:p>
+          <w:p>
+            <w:pPr>
+              <w:jc w:val="center"/>
+              <w:spacing w:after="0"/>
+            </w:pPr>
+            <w:r>
+              <w:rPr>
+                <w:rFonts w:ascii="Arial" w:hAnsi="Arial" w:cs="Arial"/>
+                <w:i/>
+                <w:color w:val="BF360C"/>
+                <w:sz w:val="17"/>
+                <w:szCs w:val="17"/>
+              </w:rPr>
+              <w:t>337 | 243</w:t>
             </w:r>
           </w:p>
         </w:tc>
@@ -1872,7 +2384,52 @@
                 <w:sz w:val="17"/>
                 <w:szCs w:val="17"/>
               </w:rPr>
-              <w:t>Not incident AKI eligible — label NA (CKD-only, repeat AKI, prior renal impairment)</w:t>
+              <w:t>Not incident AKI eligible — label NA (overlapping reasons)</w:t>
+            </w:r>
+          </w:p>
+          <w:p>
+            <w:pPr>
+              <w:ind w:left="240"/>
+            </w:pPr>
+            <w:r>
+              <w:rPr>
+                <w:rFonts w:ascii="Arial" w:hAnsi="Arial" w:cs="Arial"/>
+                <w:i/>
+                <w:color w:val="BF360C"/>
+                <w:sz w:val="17"/>
+                <w:szCs w:val="17"/>
+              </w:rPr>
+              <w:t xml:space="preserve">  CKD-only admissions (no AKI)</w:t>
+            </w:r>
+          </w:p>
+          <w:p>
+            <w:pPr>
+              <w:ind w:left="240"/>
+            </w:pPr>
+            <w:r>
+              <w:rPr>
+                <w:rFonts w:ascii="Arial" w:hAnsi="Arial" w:cs="Arial"/>
+                <w:i/>
+                <w:color w:val="BF360C"/>
+                <w:sz w:val="17"/>
+                <w:szCs w:val="17"/>
+              </w:rPr>
+              <w:t xml:space="preserve">  Repeat AKI (prior AKI history)</w:t>
+            </w:r>
+          </w:p>
+          <w:p>
+            <w:pPr>
+              <w:ind w:left="240"/>
+            </w:pPr>
+            <w:r>
+              <w:rPr>
+                <w:rFonts w:ascii="Arial" w:hAnsi="Arial" w:cs="Arial"/>
+                <w:i/>
+                <w:color w:val="BF360C"/>
+                <w:sz w:val="17"/>
+                <w:szCs w:val="17"/>
+              </w:rPr>
+              <w:t xml:space="preserve">  Prior renal impairment, no current AKI</w:t>
             </w:r>
           </w:p>
         </w:tc>
@@ -1895,6 +2452,51 @@
               <w:t>−92,280</w:t>
             </w:r>
           </w:p>
+          <w:p>
+            <w:pPr>
+              <w:jc w:val="center"/>
+            </w:pPr>
+            <w:r>
+              <w:rPr>
+                <w:rFonts w:ascii="Arial" w:hAnsi="Arial" w:cs="Arial"/>
+                <w:i/>
+                <w:color w:val="BF360C"/>
+                <w:sz w:val="17"/>
+                <w:szCs w:val="17"/>
+              </w:rPr>
+              <w:t>51,606</w:t>
+            </w:r>
+          </w:p>
+          <w:p>
+            <w:pPr>
+              <w:jc w:val="center"/>
+            </w:pPr>
+            <w:r>
+              <w:rPr>
+                <w:rFonts w:ascii="Arial" w:hAnsi="Arial" w:cs="Arial"/>
+                <w:i/>
+                <w:color w:val="BF360C"/>
+                <w:sz w:val="17"/>
+                <w:szCs w:val="17"/>
+              </w:rPr>
+              <w:t>58,278</w:t>
+            </w:r>
+          </w:p>
+          <w:p>
+            <w:pPr>
+              <w:jc w:val="center"/>
+            </w:pPr>
+            <w:r>
+              <w:rPr>
+                <w:rFonts w:ascii="Arial" w:hAnsi="Arial" w:cs="Arial"/>
+                <w:i/>
+                <w:color w:val="BF360C"/>
+                <w:sz w:val="17"/>
+                <w:szCs w:val="17"/>
+              </w:rPr>
+              <w:t>65,599</w:t>
+            </w:r>
+          </w:p>
         </w:tc>
         <w:tc>
           <w:tcPr>
@@ -1913,6 +2515,51 @@
                 <w:szCs w:val="17"/>
               </w:rPr>
               <w:t>−5,700</w:t>
+            </w:r>
+          </w:p>
+          <w:p>
+            <w:pPr>
+              <w:jc w:val="center"/>
+            </w:pPr>
+            <w:r>
+              <w:rPr>
+                <w:rFonts w:ascii="Arial" w:hAnsi="Arial" w:cs="Arial"/>
+                <w:i/>
+                <w:color w:val="BF360C"/>
+                <w:sz w:val="17"/>
+                <w:szCs w:val="17"/>
+              </w:rPr>
+              <w:t>3,715</w:t>
+            </w:r>
+          </w:p>
+          <w:p>
+            <w:pPr>
+              <w:jc w:val="center"/>
+            </w:pPr>
+            <w:r>
+              <w:rPr>
+                <w:rFonts w:ascii="Arial" w:hAnsi="Arial" w:cs="Arial"/>
+                <w:i/>
+                <w:color w:val="BF360C"/>
+                <w:sz w:val="17"/>
+                <w:szCs w:val="17"/>
+              </w:rPr>
+              <w:t>2,693</w:t>
+            </w:r>
+          </w:p>
+          <w:p>
+            <w:pPr>
+              <w:jc w:val="center"/>
+            </w:pPr>
+            <w:r>
+              <w:rPr>
+                <w:rFonts w:ascii="Arial" w:hAnsi="Arial" w:cs="Arial"/>
+                <w:i/>
+                <w:color w:val="BF360C"/>
+                <w:sz w:val="17"/>
+                <w:szCs w:val="17"/>
+              </w:rPr>
+              <w:t>2,277</w:t>
             </w:r>
           </w:p>
         </w:tc>
@@ -2339,6 +2986,62 @@
             <w:r>
               <w:rPr>
                 <w:rFonts w:ascii="Arial" w:hAnsi="Arial" w:cs="Arial"/>
+                <w:sz w:val="18"/>
+                <w:szCs w:val="18"/>
+              </w:rPr>
+              <w:t xml:space="preserve">   CKD survival exclusions (CKD/ESRD &lt;90d, no follow-up)</w:t>
+            </w:r>
+          </w:p>
+        </w:tc>
+        <w:tc>
+          <w:tcPr>
+            <w:tcW w:w="2000" w:type="dxa"/>
+            <w:shd w:val="clear" w:fill="EBF3FB"/>
+          </w:tcPr>
+          <w:p>
+            <w:pPr>
+              <w:jc w:val="center"/>
+            </w:pPr>
+            <w:r>
+              <w:rPr>
+                <w:rFonts w:ascii="Arial" w:hAnsi="Arial" w:cs="Arial"/>
+                <w:sz w:val="18"/>
+                <w:szCs w:val="18"/>
+              </w:rPr>
+              <w:t>−3,889</w:t>
+            </w:r>
+          </w:p>
+        </w:tc>
+        <w:tc>
+          <w:tcPr>
+            <w:tcW w:w="2000" w:type="dxa"/>
+            <w:shd w:val="clear" w:fill="EBF3FB"/>
+          </w:tcPr>
+          <w:p>
+            <w:pPr>
+              <w:jc w:val="center"/>
+            </w:pPr>
+            <w:r>
+              <w:rPr>
+                <w:rFonts w:ascii="Arial" w:hAnsi="Arial" w:cs="Arial"/>
+                <w:sz w:val="18"/>
+                <w:szCs w:val="18"/>
+              </w:rPr>
+              <w:t>−99</w:t>
+            </w:r>
+          </w:p>
+        </w:tc>
+      </w:tr>
+      <w:tr>
+        <w:tc>
+          <w:tcPr>
+            <w:tcW w:w="5360" w:type="dxa"/>
+            <w:shd w:val="clear" w:fill="EBF3FB"/>
+          </w:tcPr>
+          <w:p>
+            <w:r>
+              <w:rPr>
+                <w:rFonts w:ascii="Arial" w:hAnsi="Arial" w:cs="Arial"/>
                 <w:b/>
                 <w:sz w:val="18"/>
                 <w:szCs w:val="18"/>
@@ -2363,7 +3066,7 @@
                 <w:sz w:val="18"/>
                 <w:szCs w:val="18"/>
               </w:rPr>
-              <w:t>N = 40,392</w:t>
+              <w:t>N = 36,503</w:t>
             </w:r>
           </w:p>
         </w:tc>
@@ -2383,7 +3086,7 @@
                 <w:sz w:val="18"/>
                 <w:szCs w:val="18"/>
               </w:rPr>
-              <w:t>N = 9,109</w:t>
+              <w:t>N = 9,010</w:t>
             </w:r>
           </w:p>
         </w:tc>

</xml_diff>

<commit_message>
Fix flowchart numbers and add per-version count scripts
- flow_diagram_current.docx: correct exclusion boxes (7,419 MIMIC-IV,
  690 MIMIC-III), remove fabricated CKD/ESRD/transplant bullets, fix
  NA sub-breakdown to mutually exclusive categories summing correctly,
  restore Dedup label (was wrongly changed to missing lab/vitals)
- flowchart_numbers_mimic4.csv / mimic3.csv: verified admission + patient
  counts for every flowchart step from data.pkl and features_all.parquet
- flowchart/compute_flowchart_counts.py: reproducible script generating
  both CSVs from scratch
- bootstrap_elasticnet_coef.py: tol=1e-3 for faster convergence
</commit_message>
<xml_diff>
--- a/flow_diagram_current.docx
+++ b/flow_diagram_current.docx
@@ -278,7 +278,7 @@
                 <w:sz w:val="18"/>
                 <w:szCs w:val="18"/>
               </w:rPr>
-              <w:t>Excluded: 89,148 admissions | 31,418 patients</w:t>
+              <w:t>Excluded: 7,419 admissions</w:t>
             </w:r>
           </w:p>
           <w:p>
@@ -291,7 +291,7 @@
                 <w:sz w:val="17"/>
                 <w:szCs w:val="17"/>
               </w:rPr>
-              <w:t>• Age &lt;18 years: 0 adm | 0 patients</w:t>
+              <w:t>• Age &lt;18 years: 0 admissions</w:t>
             </w:r>
           </w:p>
           <w:p>
@@ -304,7 +304,7 @@
                 <w:sz w:val="17"/>
                 <w:szCs w:val="17"/>
               </w:rPr>
-              <w:t>• Primary AKI: 6,888 adm | 5,627 patients</w:t>
+              <w:t>• Primary AKI (presenting diagnosis): 6,888 admissions</w:t>
             </w:r>
           </w:p>
           <w:p>
@@ -317,7 +317,7 @@
                 <w:sz w:val="17"/>
                 <w:szCs w:val="17"/>
               </w:rPr>
-              <w:t>• Prior CKD: 82,860 adm | 29,257 patients</w:t>
+              <w:t>• Admissions without diagnosis data: 531</w:t>
             </w:r>
           </w:p>
           <w:p>
@@ -330,7 +330,7 @@
                 <w:sz w:val="17"/>
                 <w:szCs w:val="17"/>
               </w:rPr>
-              <w:t>• ESRD/dialysis: 17,911 adm | 4,750 patients</w:t>
+              <w:t/>
             </w:r>
           </w:p>
           <w:p>
@@ -343,7 +343,7 @@
                 <w:sz w:val="17"/>
                 <w:szCs w:val="17"/>
               </w:rPr>
-              <w:t>• Kidney transplant: 5,225 adm | 1,365 patients</w:t>
+              <w:t/>
             </w:r>
           </w:p>
         </w:tc>
@@ -390,7 +390,7 @@
                 <w:sz w:val="18"/>
                 <w:szCs w:val="18"/>
               </w:rPr>
-              <w:t>Excluded: 15,749 admissions | 13,304 patients</w:t>
+              <w:t>Excluded: 690 admissions</w:t>
             </w:r>
           </w:p>
           <w:p>
@@ -403,7 +403,7 @@
                 <w:sz w:val="17"/>
                 <w:szCs w:val="17"/>
               </w:rPr>
-              <w:t>• Age &lt;18 years: 8,180 adm | 7,942 patients</w:t>
+              <w:t>• Primary AKI (presenting diagnosis): 645 admissions</w:t>
             </w:r>
           </w:p>
           <w:p>
@@ -416,7 +416,7 @@
                 <w:sz w:val="17"/>
                 <w:szCs w:val="17"/>
               </w:rPr>
-              <w:t>• Primary AKI: 645 adm | 622 patients</w:t>
+              <w:t>• Admissions without diagnosis data: 45</w:t>
             </w:r>
           </w:p>
           <w:p>
@@ -429,7 +429,7 @@
                 <w:sz w:val="17"/>
                 <w:szCs w:val="17"/>
               </w:rPr>
-              <w:t>• Prior CKD: 6,918 adm | 4,897 patients</w:t>
+              <w:t/>
             </w:r>
           </w:p>
           <w:p>
@@ -442,7 +442,7 @@
                 <w:sz w:val="17"/>
                 <w:szCs w:val="17"/>
               </w:rPr>
-              <w:t>• ESRD/dialysis: 1,986 adm | 1,126 patients</w:t>
+              <w:t/>
             </w:r>
           </w:p>
           <w:p>
@@ -455,7 +455,7 @@
                 <w:sz w:val="17"/>
                 <w:szCs w:val="17"/>
               </w:rPr>
-              <w:t>• Kidney transplant: 337 adm | 243 patients</w:t>
+              <w:t/>
             </w:r>
           </w:p>
         </w:tc>
@@ -638,7 +638,7 @@
                 <w:sz w:val="18"/>
                 <w:szCs w:val="18"/>
               </w:rPr>
-              <w:t>Not incident AKI eligible (label NA): 92,280 adm | 27,573 patients</w:t>
+              <w:t>Not incident AKI eligible (label NA): 92,280 admissions</w:t>
             </w:r>
           </w:p>
           <w:p>
@@ -651,7 +651,7 @@
                 <w:sz w:val="17"/>
                 <w:szCs w:val="17"/>
               </w:rPr>
-              <w:t>• CKD-only admissions (no AKI): 51,606 adm | 20,830 patients</w:t>
+              <w:t>• CKD-only admissions (no AKI): 51,606 admissions</w:t>
             </w:r>
           </w:p>
           <w:p>
@@ -664,7 +664,7 @@
                 <w:sz w:val="17"/>
                 <w:szCs w:val="17"/>
               </w:rPr>
-              <w:t>• Repeat AKI (prior AKI history): 58,278 adm | 15,188 patients</w:t>
+              <w:t>• Non-incident AKI (repeat or AKI+CKD): 25,922 admissions</w:t>
             </w:r>
           </w:p>
           <w:p>
@@ -677,7 +677,7 @@
                 <w:sz w:val="17"/>
                 <w:szCs w:val="17"/>
               </w:rPr>
-              <w:t>• Prior renal impairment, no current AKI: 65,599 adm | 15,602 patients</w:t>
+              <w:t>• Prior renal impairment (no current AKI/CKD): 14,752 admissions</w:t>
             </w:r>
           </w:p>
         </w:tc>
@@ -724,7 +724,7 @@
                 <w:sz w:val="18"/>
                 <w:szCs w:val="18"/>
               </w:rPr>
-              <w:t>Not incident AKI eligible (label NA): 5,700 adm | 3,669 patients</w:t>
+              <w:t>Not incident AKI eligible (label NA): 5,701 admissions</w:t>
             </w:r>
           </w:p>
           <w:p>
@@ -737,7 +737,7 @@
                 <w:sz w:val="17"/>
                 <w:szCs w:val="17"/>
               </w:rPr>
-              <w:t>• CKD-only admissions (no AKI): 3,715 adm | 2,687 patients</w:t>
+              <w:t>• CKD-only admissions (no AKI): 3,715 admissions</w:t>
             </w:r>
           </w:p>
           <w:p>
@@ -750,7 +750,7 @@
                 <w:sz w:val="17"/>
                 <w:szCs w:val="17"/>
               </w:rPr>
-              <w:t>• Repeat AKI (prior AKI history): 2,693 adm | 1,499 patients</w:t>
+              <w:t>• Non-incident AKI (repeat or AKI+CKD): 1,661 admissions</w:t>
             </w:r>
           </w:p>
           <w:p>
@@ -763,7 +763,7 @@
                 <w:sz w:val="17"/>
                 <w:szCs w:val="17"/>
               </w:rPr>
-              <w:t>• Prior renal impairment, no current AKI: 2,277 adm | 1,175 patients</w:t>
+              <w:t>• Prior renal impairment (no current AKI/CKD): 325 admissions</w:t>
             </w:r>
           </w:p>
         </w:tc>
@@ -930,7 +930,7 @@
                 <w:sz w:val="19"/>
                 <w:szCs w:val="19"/>
               </w:rPr>
-              <w:t>35,267</w:t>
+              <w:t>35,312</w:t>
             </w:r>
           </w:p>
         </w:tc>
@@ -1004,7 +1004,9 @@
                 <w:sz w:val="18"/>
                 <w:szCs w:val="18"/>
               </w:rPr>
-              <w:t>Dedup to patient-level: 232,299 dropped</w:t>
+              <w:t>Dedup to patient-level: 232,299 dropped
+• Keep first AKI+ admission per patient
+• Keep last AKI− admission per patient; drop rest</w:t>
             </w:r>
           </w:p>
           <w:p>
@@ -1017,7 +1019,7 @@
                 <w:sz w:val="17"/>
                 <w:szCs w:val="17"/>
               </w:rPr>
-              <w:t>• Keep first AKI+ admission per patient</w:t>
+              <w:t/>
             </w:r>
           </w:p>
           <w:p>
@@ -1030,7 +1032,7 @@
                 <w:sz w:val="17"/>
                 <w:szCs w:val="17"/>
               </w:rPr>
-              <w:t>• Keep last AKI− admission per patient; drop rest</w:t>
+              <w:t/>
             </w:r>
           </w:p>
         </w:tc>
@@ -1077,7 +1079,9 @@
                 <w:sz w:val="18"/>
                 <w:szCs w:val="18"/>
               </w:rPr>
-              <w:t>Dedup to patient-level: 7,914 dropped</w:t>
+              <w:t>Dedup to patient-level: 7,959 dropped
+• Keep first AKI+ admission per patient
+• Keep last AKI− admission per patient; drop rest</w:t>
             </w:r>
           </w:p>
           <w:p>
@@ -1090,7 +1094,7 @@
                 <w:sz w:val="17"/>
                 <w:szCs w:val="17"/>
               </w:rPr>
-              <w:t>• Keep first AKI+ admission per patient</w:t>
+              <w:t/>
             </w:r>
           </w:p>
           <w:p>
@@ -1103,7 +1107,7 @@
                 <w:sz w:val="17"/>
                 <w:szCs w:val="17"/>
               </w:rPr>
-              <w:t>• Keep last AKI− admission per patient; drop rest</w:t>
+              <w:t/>
             </w:r>
           </w:p>
         </w:tc>
@@ -2030,7 +2034,7 @@
                 <w:sz w:val="17"/>
                 <w:szCs w:val="17"/>
               </w:rPr>
-              <w:t>Excluded (admissions | patients, overlapping)</w:t>
+              <w:t>Excluded</w:t>
             </w:r>
           </w:p>
           <w:p>
@@ -2125,7 +2129,7 @@
                 <w:sz w:val="17"/>
                 <w:szCs w:val="17"/>
               </w:rPr>
-              <w:t>89,148 | 31,418</w:t>
+              <w:t>7,419</w:t>
             </w:r>
           </w:p>
           <w:p>
@@ -2141,7 +2145,7 @@
                 <w:sz w:val="17"/>
                 <w:szCs w:val="17"/>
               </w:rPr>
-              <w:t>0 | 0</w:t>
+              <w:t>0</w:t>
             </w:r>
           </w:p>
           <w:p>
@@ -2157,7 +2161,7 @@
                 <w:sz w:val="17"/>
                 <w:szCs w:val="17"/>
               </w:rPr>
-              <w:t>6,888 | 5,627</w:t>
+              <w:t>6,888</w:t>
             </w:r>
           </w:p>
           <w:p>
@@ -2173,7 +2177,7 @@
                 <w:sz w:val="17"/>
                 <w:szCs w:val="17"/>
               </w:rPr>
-              <w:t>82,860 | 29,257</w:t>
+              <w:t>531</w:t>
             </w:r>
           </w:p>
           <w:p>
@@ -2189,7 +2193,7 @@
                 <w:sz w:val="17"/>
                 <w:szCs w:val="17"/>
               </w:rPr>
-              <w:t>17,911 | 4,750</w:t>
+              <w:t/>
             </w:r>
           </w:p>
           <w:p>
@@ -2205,7 +2209,7 @@
                 <w:sz w:val="17"/>
                 <w:szCs w:val="17"/>
               </w:rPr>
-              <w:t>5,225 | 1,365</w:t>
+              <w:t/>
             </w:r>
           </w:p>
         </w:tc>
@@ -2225,7 +2229,7 @@
                 <w:sz w:val="17"/>
                 <w:szCs w:val="17"/>
               </w:rPr>
-              <w:t>15,749 | 13,304</w:t>
+              <w:t>690</w:t>
             </w:r>
           </w:p>
           <w:p>
@@ -2241,7 +2245,7 @@
                 <w:sz w:val="17"/>
                 <w:szCs w:val="17"/>
               </w:rPr>
-              <w:t>8,180 | 7,942</w:t>
+              <w:t>0</w:t>
             </w:r>
           </w:p>
           <w:p>
@@ -2257,7 +2261,7 @@
                 <w:sz w:val="17"/>
                 <w:szCs w:val="17"/>
               </w:rPr>
-              <w:t>645 | 622</w:t>
+              <w:t>645</w:t>
             </w:r>
           </w:p>
           <w:p>
@@ -2273,7 +2277,7 @@
                 <w:sz w:val="17"/>
                 <w:szCs w:val="17"/>
               </w:rPr>
-              <w:t>6,918 | 4,897</w:t>
+              <w:t>45</w:t>
             </w:r>
           </w:p>
           <w:p>
@@ -2289,7 +2293,7 @@
                 <w:sz w:val="17"/>
                 <w:szCs w:val="17"/>
               </w:rPr>
-              <w:t>1,986 | 1,126</w:t>
+              <w:t/>
             </w:r>
           </w:p>
           <w:p>
@@ -2305,7 +2309,7 @@
                 <w:sz w:val="17"/>
                 <w:szCs w:val="17"/>
               </w:rPr>
-              <w:t>337 | 243</w:t>
+              <w:t/>
             </w:r>
           </w:p>
         </w:tc>
@@ -2479,7 +2483,7 @@
                 <w:sz w:val="17"/>
                 <w:szCs w:val="17"/>
               </w:rPr>
-              <w:t>58,278</w:t>
+              <w:t>25,922</w:t>
             </w:r>
           </w:p>
           <w:p>
@@ -2494,7 +2498,7 @@
                 <w:sz w:val="17"/>
                 <w:szCs w:val="17"/>
               </w:rPr>
-              <w:t>65,599</w:t>
+              <w:t>14,752</w:t>
             </w:r>
           </w:p>
         </w:tc>
@@ -2514,7 +2518,7 @@
                 <w:sz w:val="17"/>
                 <w:szCs w:val="17"/>
               </w:rPr>
-              <w:t>−5,700</w:t>
+              <w:t>−5,701</w:t>
             </w:r>
           </w:p>
           <w:p>
@@ -2544,7 +2548,7 @@
                 <w:sz w:val="17"/>
                 <w:szCs w:val="17"/>
               </w:rPr>
-              <w:t>2,693</w:t>
+              <w:t>1,661</w:t>
             </w:r>
           </w:p>
           <w:p>
@@ -2559,7 +2563,7 @@
                 <w:sz w:val="17"/>
                 <w:szCs w:val="17"/>
               </w:rPr>
-              <w:t>2,277</w:t>
+              <w:t>325</w:t>
             </w:r>
           </w:p>
         </w:tc>
@@ -2796,7 +2800,7 @@
                 <w:sz w:val="17"/>
                 <w:szCs w:val="17"/>
               </w:rPr>
-              <w:t>−7,914</w:t>
+              <w:t>−7,959</w:t>
             </w:r>
           </w:p>
         </w:tc>

</xml_diff>